<commit_message>
Dashboard live-edge kWh panel + demo-run verification (report .md/.docx)
- grafana: kWh per 30-min panel now self-anchors to the last 24h relative
  to MAX(reading_time) instead of the full replay window; default dashboard
  time range narrowed to bracket the live edge (Feb 26-28).
- defence_queries.sql: query 6 comment corrected to the real measured CORR
  (-0.137 at full 21.5M load) — was overstated as -0.7..-0.9.
- PROJECT_REPORT (.md + .docx): demo-run section updated with the 2026-06-27
  full-pipeline verification and the rolling-window dashboard change.

Co-Authored-By: Claude Opus 4.8 <noreply@anthropic.com>
</commit_message>
<xml_diff>
--- a/PROJECT_REPORT.docx
+++ b/PROJECT_REPORT.docx
@@ -18479,6 +18479,52 @@
           <w:szCs w:val="22"/>
         </w:rPr>
         <w:t>המערכת עומדת בכל שלוש הדרישות: לוח בקרה תפעולי חי שמתעדכן תוך שניות, משטח אנליסטים עם שש שאילתות ההגנה (כולן רצות), ובסיס תפעולי שעולה בפקודה אחת ושורד הפעלות מחדש. תיקנו למעלה מעשרה תקלים אמיתיים — חלקם עקרוניים — ואימתנו את כולם בהרצה חיה, כולל הזרקת נתונים שגרמה לכל הפאנלים להציג ולהשתנות על המסך.</w:t>
+      </w:r>
+    </w:p>
+    <w:p>
+      <w:pPr>
+        <w:bidi/>
+        <w:spacing w:after="120"/>
+        <w:jc w:val="right"/>
+      </w:pPr>
+      <w:r>
+        <w:rPr>
+          <w:rFonts w:ascii="Arial" w:hAnsi="Arial" w:cs="Arial"/>
+          <w:b/>
+          <w:sz w:val="22"/>
+        </w:rPr>
+        <w:t>אימות הרצה אחרון (27.06.2026).</w:t>
+      </w:r>
+      <w:r>
+        <w:rPr>
+          <w:rFonts w:ascii="Arial" w:hAnsi="Arial" w:cs="Arial"/>
+          <w:b w:val="0"/>
+          <w:sz w:val="22"/>
+        </w:rPr>
+        <w:t xml:space="preserve"> הרצנו את הצינור המלא חי ואימתנו מקצה לקצה: clean_readings מכיל 21,506,805 קריאות (הטעינה ההיסטורית המלאה הושלמה), טריגר התיקונים יורה, סטטיסטיקות ה-lag מתעדכנות לכל 5,083 המונים, וחיזוי-הכיסוי פעיל. make demo רץ דרך המסלול האמיתי (שגשר → Kafka → Spark → ולידציה → DB) והפיק 24 דחיות שנחתו ב-rejected_readings; Grafana בריא עם כל 12 הפאנלים. שאילתת הגנה 6 (מתאם טמפרטורה–צריכה) נמדדה על העומס המלא: r = -0.137 — מתאם שלילי חלש בכיוון הצפוי (קר → יותר צריכה).</w:t>
+      </w:r>
+    </w:p>
+    <w:p>
+      <w:pPr>
+        <w:bidi/>
+        <w:spacing w:after="120"/>
+        <w:jc w:val="right"/>
+      </w:pPr>
+      <w:r>
+        <w:rPr>
+          <w:rFonts w:ascii="Arial" w:hAnsi="Arial" w:cs="Arial"/>
+          <w:b/>
+          <w:sz w:val="22"/>
+        </w:rPr>
+        <w:t>תצוגת חלון מתגלגל בלוח.</w:t>
+      </w:r>
+      <w:r>
+        <w:rPr>
+          <w:rFonts w:ascii="Arial" w:hAnsi="Arial" w:cs="Arial"/>
+          <w:b w:val="0"/>
+          <w:sz w:val="22"/>
+        </w:rPr>
+        <w:t xml:space="preserve"> פאנל kWh per 30-min (Last 24h) עודכן כך שיציג רק את 24 השעות האחרונות יחסית לקצה החי של הנתונים (MAX(reading_time)), במקום כל חלון ה-replay בבת אחת — כך התצוגה תואמת לכותרת ומתמקדת בהתקדמות הזרם החי. טווח ברירת המחדל של הלוח צומצם בהתאם (26–28 בפבר') כך שציר הזמן ממסגר את החלון.</w:t>
       </w:r>
     </w:p>
     <w:p>

</xml_diff>